<commit_message>
Auto-push new or updated Python file
</commit_message>
<xml_diff>
--- a/ML_LAB10_OUTPUTS.docx
+++ b/ML_LAB10_OUTPUTS.docx
@@ -46,7 +46,23 @@
           <w:color w:val="EE0000"/>
           <w:highlight w:val="yellow"/>
         </w:rPr>
-        <w:t xml:space="preserve"> , KINDLY INSERT IT AS A TABLE IN THE DOCUMENT U SEND ME , IF THERE IS ANY REFERNCE TO A TABLE WITHOUT IT BEING PRESENT IN TABLE FORMAT, I WONT BE INCLUDING IT IN THE LATEX REPORT</w:t>
+        <w:t xml:space="preserve">, KINDLY INSERT IT AS A TABLE IN THE DOCUMENT U SEND </w:t>
+      </w:r>
+      <w:proofErr w:type="gramStart"/>
+      <w:r>
+        <w:rPr>
+          <w:color w:val="EE0000"/>
+          <w:highlight w:val="yellow"/>
+        </w:rPr>
+        <w:t>ME ,</w:t>
+      </w:r>
+      <w:proofErr w:type="gramEnd"/>
+      <w:r>
+        <w:rPr>
+          <w:color w:val="EE0000"/>
+          <w:highlight w:val="yellow"/>
+        </w:rPr>
+        <w:t xml:space="preserve"> IF THERE IS ANY REFERNCE TO A TABLE WITHOUT IT BEING PRESENT IN TABLE FORMAT, I WONT BE INCLUDING IT IN THE LATEX REPORT</w:t>
       </w:r>
     </w:p>
     <w:p>
@@ -1488,9 +1504,970 @@
     </w:p>
     <w:p>
       <w:r>
+        <w:rPr>
+          <w:highlight w:val="yellow"/>
+        </w:rPr>
         <w:t>A4</w:t>
       </w:r>
     </w:p>
+    <w:p>
+      <w:r>
+        <w:drawing>
+          <wp:inline distT="0" distB="0" distL="0" distR="0" wp14:anchorId="475A3469" wp14:editId="636FD7D6">
+            <wp:extent cx="4661535" cy="2700916"/>
+            <wp:effectExtent l="0" t="0" r="5715" b="4445"/>
+            <wp:docPr id="1870908774" name="Picture 1"/>
+            <wp:cNvGraphicFramePr>
+              <a:graphicFrameLocks xmlns:a="http://schemas.openxmlformats.org/drawingml/2006/main" noChangeAspect="1"/>
+            </wp:cNvGraphicFramePr>
+            <a:graphic xmlns:a="http://schemas.openxmlformats.org/drawingml/2006/main">
+              <a:graphicData uri="http://schemas.openxmlformats.org/drawingml/2006/picture">
+                <pic:pic xmlns:pic="http://schemas.openxmlformats.org/drawingml/2006/picture">
+                  <pic:nvPicPr>
+                    <pic:cNvPr id="1870908774" name=""/>
+                    <pic:cNvPicPr/>
+                  </pic:nvPicPr>
+                  <pic:blipFill>
+                    <a:blip r:embed="rId13"/>
+                    <a:stretch>
+                      <a:fillRect/>
+                    </a:stretch>
+                  </pic:blipFill>
+                  <pic:spPr>
+                    <a:xfrm>
+                      <a:off x="0" y="0"/>
+                      <a:ext cx="4676983" cy="2709867"/>
+                    </a:xfrm>
+                    <a:prstGeom prst="rect">
+                      <a:avLst/>
+                    </a:prstGeom>
+                  </pic:spPr>
+                </pic:pic>
+              </a:graphicData>
+            </a:graphic>
+          </wp:inline>
+        </w:drawing>
+      </w:r>
+    </w:p>
+    <w:p/>
+    <w:p>
+      <w:pPr>
+        <w:numPr>
+          <w:ilvl w:val="0"/>
+          <w:numId w:val="7"/>
+        </w:numPr>
+      </w:pPr>
+      <w:r>
+        <w:rPr>
+          <w:b/>
+          <w:bCs/>
+        </w:rPr>
+        <w:t>Random Forest</w:t>
+      </w:r>
+    </w:p>
+    <w:p>
+      <w:pPr>
+        <w:numPr>
+          <w:ilvl w:val="1"/>
+          <w:numId w:val="7"/>
+        </w:numPr>
+      </w:pPr>
+      <w:r>
+        <w:rPr>
+          <w:b/>
+          <w:bCs/>
+        </w:rPr>
+        <w:t>Baseline:</w:t>
+      </w:r>
+      <w:r>
+        <w:t xml:space="preserve"> Acc </w:t>
+      </w:r>
+      <w:r>
+        <w:rPr>
+          <w:b/>
+          <w:bCs/>
+        </w:rPr>
+        <w:t>0.833</w:t>
+      </w:r>
+      <w:r>
+        <w:t xml:space="preserve">, F1 </w:t>
+      </w:r>
+      <w:r>
+        <w:rPr>
+          <w:b/>
+          <w:bCs/>
+        </w:rPr>
+        <w:t>0.778</w:t>
+      </w:r>
+      <w:r>
+        <w:t xml:space="preserve"> (best)</w:t>
+      </w:r>
+    </w:p>
+    <w:p>
+      <w:pPr>
+        <w:numPr>
+          <w:ilvl w:val="1"/>
+          <w:numId w:val="7"/>
+        </w:numPr>
+      </w:pPr>
+      <w:r>
+        <w:rPr>
+          <w:b/>
+          <w:bCs/>
+        </w:rPr>
+        <w:t>RFE (k=2: ['mfcc1','rms']):</w:t>
+      </w:r>
+      <w:r>
+        <w:t xml:space="preserve"> </w:t>
+      </w:r>
+      <w:r>
+        <w:rPr>
+          <w:b/>
+          <w:bCs/>
+        </w:rPr>
+        <w:t>Acc 0.833</w:t>
+      </w:r>
+      <w:r>
+        <w:t xml:space="preserve">, </w:t>
+      </w:r>
+      <w:r>
+        <w:rPr>
+          <w:b/>
+          <w:bCs/>
+        </w:rPr>
+        <w:t>F1 0.778</w:t>
+      </w:r>
+      <w:r>
+        <w:t xml:space="preserve"> → </w:t>
+      </w:r>
+      <w:r>
+        <w:rPr>
+          <w:i/>
+          <w:iCs/>
+        </w:rPr>
+        <w:t>matches baseline with 60% fewer features.</w:t>
+      </w:r>
+    </w:p>
+    <w:p>
+      <w:pPr>
+        <w:numPr>
+          <w:ilvl w:val="1"/>
+          <w:numId w:val="7"/>
+        </w:numPr>
+      </w:pPr>
+      <w:r>
+        <w:rPr>
+          <w:b/>
+          <w:bCs/>
+        </w:rPr>
+        <w:t>PCA (99%/95%) &amp; SFS (k=2):</w:t>
+      </w:r>
+      <w:r>
+        <w:t xml:space="preserve"> drop to </w:t>
+      </w:r>
+      <w:r>
+        <w:rPr>
+          <w:b/>
+          <w:bCs/>
+        </w:rPr>
+        <w:t>0.667 / 0.400–0.296</w:t>
+      </w:r>
+      <w:r>
+        <w:t xml:space="preserve"> → trees don’t love PCA rotations or the smaller SFS subsets here.</w:t>
+      </w:r>
+    </w:p>
+    <w:p>
+      <w:pPr>
+        <w:numPr>
+          <w:ilvl w:val="0"/>
+          <w:numId w:val="7"/>
+        </w:numPr>
+      </w:pPr>
+      <w:r>
+        <w:rPr>
+          <w:b/>
+          <w:bCs/>
+        </w:rPr>
+        <w:t>Logistic Regression</w:t>
+      </w:r>
+    </w:p>
+    <w:p>
+      <w:pPr>
+        <w:numPr>
+          <w:ilvl w:val="1"/>
+          <w:numId w:val="7"/>
+        </w:numPr>
+      </w:pPr>
+      <w:r>
+        <w:rPr>
+          <w:b/>
+          <w:bCs/>
+        </w:rPr>
+        <w:t>Baseline, PCA-99%, SFS (k=3), RFE (k=1):</w:t>
+      </w:r>
+      <w:r>
+        <w:t xml:space="preserve"> </w:t>
+      </w:r>
+      <w:r>
+        <w:rPr>
+          <w:b/>
+          <w:bCs/>
+        </w:rPr>
+        <w:t>0.667 / 0.400</w:t>
+      </w:r>
+      <w:r>
+        <w:t xml:space="preserve"> (no change)</w:t>
+      </w:r>
+    </w:p>
+    <w:p>
+      <w:pPr>
+        <w:numPr>
+          <w:ilvl w:val="1"/>
+          <w:numId w:val="7"/>
+        </w:numPr>
+      </w:pPr>
+      <w:r>
+        <w:rPr>
+          <w:b/>
+          <w:bCs/>
+        </w:rPr>
+        <w:t>PCA-95%:</w:t>
+      </w:r>
+      <w:r>
+        <w:t xml:space="preserve"> </w:t>
+      </w:r>
+      <w:r>
+        <w:rPr>
+          <w:b/>
+          <w:bCs/>
+        </w:rPr>
+        <w:t>F1 0.296</w:t>
+      </w:r>
+      <w:r>
+        <w:t xml:space="preserve"> (hurt a bit on this tiny, imbalanced set)</w:t>
+      </w:r>
+    </w:p>
+    <w:p>
+      <w:pPr>
+        <w:rPr>
+          <w:b/>
+          <w:bCs/>
+        </w:rPr>
+      </w:pPr>
+      <w:r>
+        <w:rPr>
+          <w:b/>
+          <w:bCs/>
+        </w:rPr>
+        <w:t>What this means (1–2 lines for your report)</w:t>
+      </w:r>
+    </w:p>
+    <w:p>
+      <w:pPr>
+        <w:numPr>
+          <w:ilvl w:val="0"/>
+          <w:numId w:val="8"/>
+        </w:numPr>
+      </w:pPr>
+      <w:r>
+        <w:rPr>
+          <w:b/>
+          <w:bCs/>
+        </w:rPr>
+        <w:t>Supervised selection</w:t>
+      </w:r>
+      <w:r>
+        <w:t xml:space="preserve"> with </w:t>
+      </w:r>
+      <w:r>
+        <w:rPr>
+          <w:b/>
+          <w:bCs/>
+        </w:rPr>
+        <w:t>RFE</w:t>
+      </w:r>
+      <w:r>
+        <w:t xml:space="preserve"> kept the two most useful raw features for RF (</w:t>
+      </w:r>
+      <w:r>
+        <w:rPr>
+          <w:b/>
+          <w:bCs/>
+        </w:rPr>
+        <w:t>mfcc1, rms</w:t>
+      </w:r>
+      <w:r>
+        <w:t xml:space="preserve">) and </w:t>
+      </w:r>
+      <w:r>
+        <w:rPr>
+          <w:b/>
+          <w:bCs/>
+        </w:rPr>
+        <w:t>preserved performance</w:t>
+      </w:r>
+      <w:r>
+        <w:t xml:space="preserve">, while </w:t>
+      </w:r>
+      <w:r>
+        <w:rPr>
+          <w:b/>
+          <w:bCs/>
+        </w:rPr>
+        <w:t>PCA</w:t>
+      </w:r>
+      <w:r>
+        <w:t xml:space="preserve"> (unsupervised, rotates axes) harmed RF.</w:t>
+      </w:r>
+    </w:p>
+    <w:p>
+      <w:pPr>
+        <w:numPr>
+          <w:ilvl w:val="0"/>
+          <w:numId w:val="8"/>
+        </w:numPr>
+      </w:pPr>
+      <w:r>
+        <w:t xml:space="preserve">For </w:t>
+      </w:r>
+      <w:r>
+        <w:rPr>
+          <w:b/>
+          <w:bCs/>
+        </w:rPr>
+        <w:t>LogReg</w:t>
+      </w:r>
+      <w:r>
+        <w:t xml:space="preserve">, dimensionality reduction </w:t>
+      </w:r>
+      <w:r>
+        <w:rPr>
+          <w:b/>
+          <w:bCs/>
+        </w:rPr>
+        <w:t>didn’t help</w:t>
+      </w:r>
+      <w:r>
+        <w:t>; keeping simple raw features works as well as PCA or SFS.</w:t>
+      </w:r>
+    </w:p>
+    <w:p>
+      <w:pPr>
+        <w:rPr>
+          <w:b/>
+          <w:bCs/>
+        </w:rPr>
+      </w:pPr>
+      <w:r>
+        <w:rPr>
+          <w:b/>
+          <w:bCs/>
+        </w:rPr>
+        <w:t>Ready-to-paste comparison sentence</w:t>
+      </w:r>
+    </w:p>
+    <w:p>
+      <w:r>
+        <w:t xml:space="preserve">“On our dataset (n=30, imbalanced), Random Forest with </w:t>
+      </w:r>
+      <w:r>
+        <w:rPr>
+          <w:b/>
+          <w:bCs/>
+        </w:rPr>
+        <w:t>RFE (k=2: mfcc</w:t>
+      </w:r>
+      <w:proofErr w:type="gramStart"/>
+      <w:r>
+        <w:rPr>
+          <w:b/>
+          <w:bCs/>
+        </w:rPr>
+        <w:t>1,rms</w:t>
+      </w:r>
+      <w:proofErr w:type="gramEnd"/>
+      <w:r>
+        <w:rPr>
+          <w:b/>
+          <w:bCs/>
+        </w:rPr>
+        <w:t>)</w:t>
+      </w:r>
+      <w:r>
+        <w:t xml:space="preserve"> achieved </w:t>
+      </w:r>
+      <w:r>
+        <w:rPr>
+          <w:b/>
+          <w:bCs/>
+        </w:rPr>
+        <w:t>0.833 accuracy / 0.778 macro-F1</w:t>
+      </w:r>
+      <w:r>
+        <w:t>, matching the baseline while using fewer features. PCA (99%/95%) reduced RF performance (0.667/0.400). Logistic Regression was largely unchanged across baseline, SFS and RFE (0.667/0.400), with a slight drop under PCA-95%.”</w:t>
+      </w:r>
+    </w:p>
+    <w:p>
+      <w:pPr>
+        <w:rPr>
+          <w:b/>
+          <w:bCs/>
+        </w:rPr>
+      </w:pPr>
+      <w:r>
+        <w:rPr>
+          <w:b/>
+          <w:bCs/>
+        </w:rPr>
+        <w:t>Recommendations</w:t>
+      </w:r>
+    </w:p>
+    <w:p>
+      <w:pPr>
+        <w:numPr>
+          <w:ilvl w:val="0"/>
+          <w:numId w:val="9"/>
+        </w:numPr>
+      </w:pPr>
+      <w:r>
+        <w:rPr>
+          <w:b/>
+          <w:bCs/>
+        </w:rPr>
+        <w:t>Deploy RF + RFE(k=2)</w:t>
+      </w:r>
+      <w:r>
+        <w:t xml:space="preserve"> for a compact, strong model.</w:t>
+      </w:r>
+    </w:p>
+    <w:p>
+      <w:pPr>
+        <w:numPr>
+          <w:ilvl w:val="0"/>
+          <w:numId w:val="9"/>
+        </w:numPr>
+      </w:pPr>
+      <w:r>
+        <w:t xml:space="preserve">Keep </w:t>
+      </w:r>
+      <w:r>
+        <w:rPr>
+          <w:b/>
+          <w:bCs/>
+        </w:rPr>
+        <w:t>LogReg without PCA</w:t>
+      </w:r>
+      <w:r>
+        <w:t xml:space="preserve"> (or with PCA-99% if you must decorrelate), but don’t expect gains.</w:t>
+      </w:r>
+    </w:p>
+    <w:p>
+      <w:pPr>
+        <w:numPr>
+          <w:ilvl w:val="0"/>
+          <w:numId w:val="9"/>
+        </w:numPr>
+      </w:pPr>
+      <w:r>
+        <w:t>Report the selected subsets (you printed them) and include one of your PCA cumulative-variance plots from A2/A3.</w:t>
+      </w:r>
+    </w:p>
+    <w:p/>
+    <w:p/>
+    <w:p/>
+    <w:p/>
+    <w:p/>
+    <w:p>
+      <w:r>
+        <w:rPr>
+          <w:highlight w:val="yellow"/>
+        </w:rPr>
+        <w:lastRenderedPageBreak/>
+        <w:t>A5</w:t>
+      </w:r>
+    </w:p>
+    <w:p>
+      <w:r>
+        <w:drawing>
+          <wp:inline distT="0" distB="0" distL="0" distR="0" wp14:anchorId="0C34B30B" wp14:editId="5FB715BC">
+            <wp:extent cx="5731510" cy="2637155"/>
+            <wp:effectExtent l="0" t="0" r="2540" b="0"/>
+            <wp:docPr id="1082956631" name="Picture 1"/>
+            <wp:cNvGraphicFramePr>
+              <a:graphicFrameLocks xmlns:a="http://schemas.openxmlformats.org/drawingml/2006/main" noChangeAspect="1"/>
+            </wp:cNvGraphicFramePr>
+            <a:graphic xmlns:a="http://schemas.openxmlformats.org/drawingml/2006/main">
+              <a:graphicData uri="http://schemas.openxmlformats.org/drawingml/2006/picture">
+                <pic:pic xmlns:pic="http://schemas.openxmlformats.org/drawingml/2006/picture">
+                  <pic:nvPicPr>
+                    <pic:cNvPr id="1082956631" name=""/>
+                    <pic:cNvPicPr/>
+                  </pic:nvPicPr>
+                  <pic:blipFill>
+                    <a:blip r:embed="rId14"/>
+                    <a:stretch>
+                      <a:fillRect/>
+                    </a:stretch>
+                  </pic:blipFill>
+                  <pic:spPr>
+                    <a:xfrm>
+                      <a:off x="0" y="0"/>
+                      <a:ext cx="5731510" cy="2637155"/>
+                    </a:xfrm>
+                    <a:prstGeom prst="rect">
+                      <a:avLst/>
+                    </a:prstGeom>
+                  </pic:spPr>
+                </pic:pic>
+              </a:graphicData>
+            </a:graphic>
+          </wp:inline>
+        </w:drawing>
+      </w:r>
+    </w:p>
+    <w:p>
+      <w:r>
+        <w:drawing>
+          <wp:inline distT="0" distB="0" distL="0" distR="0" wp14:anchorId="333316E9" wp14:editId="300B314A">
+            <wp:extent cx="5731510" cy="941070"/>
+            <wp:effectExtent l="0" t="0" r="2540" b="0"/>
+            <wp:docPr id="158213692" name="Picture 1"/>
+            <wp:cNvGraphicFramePr>
+              <a:graphicFrameLocks xmlns:a="http://schemas.openxmlformats.org/drawingml/2006/main" noChangeAspect="1"/>
+            </wp:cNvGraphicFramePr>
+            <a:graphic xmlns:a="http://schemas.openxmlformats.org/drawingml/2006/main">
+              <a:graphicData uri="http://schemas.openxmlformats.org/drawingml/2006/picture">
+                <pic:pic xmlns:pic="http://schemas.openxmlformats.org/drawingml/2006/picture">
+                  <pic:nvPicPr>
+                    <pic:cNvPr id="158213692" name=""/>
+                    <pic:cNvPicPr/>
+                  </pic:nvPicPr>
+                  <pic:blipFill>
+                    <a:blip r:embed="rId15"/>
+                    <a:stretch>
+                      <a:fillRect/>
+                    </a:stretch>
+                  </pic:blipFill>
+                  <pic:spPr>
+                    <a:xfrm>
+                      <a:off x="0" y="0"/>
+                      <a:ext cx="5731510" cy="941070"/>
+                    </a:xfrm>
+                    <a:prstGeom prst="rect">
+                      <a:avLst/>
+                    </a:prstGeom>
+                  </pic:spPr>
+                </pic:pic>
+              </a:graphicData>
+            </a:graphic>
+          </wp:inline>
+        </w:drawing>
+      </w:r>
+    </w:p>
+    <w:p>
+      <w:r>
+        <w:rPr>
+          <w:b/>
+          <w:bCs/>
+        </w:rPr>
+        <w:t>Context:</w:t>
+      </w:r>
+      <w:r>
+        <w:t xml:space="preserve"> On this dataset (n=30, imbalanced), the </w:t>
+      </w:r>
+      <w:r>
+        <w:rPr>
+          <w:b/>
+          <w:bCs/>
+        </w:rPr>
+        <w:t>Random Forest</w:t>
+      </w:r>
+      <w:r>
+        <w:t xml:space="preserve"> was strongest (Acc = 0.833, F1 = 0.778).</w:t>
+      </w:r>
+    </w:p>
+    <w:p>
+      <w:pPr>
+        <w:rPr>
+          <w:b/>
+          <w:bCs/>
+        </w:rPr>
+      </w:pPr>
+      <w:r>
+        <w:rPr>
+          <w:b/>
+          <w:bCs/>
+        </w:rPr>
+        <w:t>LIME (local, per-sample)</w:t>
+      </w:r>
+    </w:p>
+    <w:p>
+      <w:pPr>
+        <w:numPr>
+          <w:ilvl w:val="0"/>
+          <w:numId w:val="10"/>
+        </w:numPr>
+      </w:pPr>
+      <w:r>
+        <w:t xml:space="preserve">Explains </w:t>
+      </w:r>
+      <w:r>
+        <w:rPr>
+          <w:b/>
+          <w:bCs/>
+        </w:rPr>
+        <w:t>one prediction at a time</w:t>
+      </w:r>
+      <w:r>
+        <w:t xml:space="preserve"> using a simple surrogate model around the chosen instance.</w:t>
+      </w:r>
+    </w:p>
+    <w:p>
+      <w:pPr>
+        <w:numPr>
+          <w:ilvl w:val="0"/>
+          <w:numId w:val="10"/>
+        </w:numPr>
+      </w:pPr>
+      <w:r>
+        <w:t xml:space="preserve">For our first two test samples, the top contributors were </w:t>
+      </w:r>
+      <w:r>
+        <w:rPr>
+          <w:b/>
+          <w:bCs/>
+        </w:rPr>
+        <w:t>mfcc1</w:t>
+      </w:r>
+      <w:r>
+        <w:t xml:space="preserve"> and </w:t>
+      </w:r>
+      <w:r>
+        <w:rPr>
+          <w:b/>
+          <w:bCs/>
+        </w:rPr>
+        <w:t>rms</w:t>
+      </w:r>
+      <w:r>
+        <w:t xml:space="preserve"> (with signs indicating whether they </w:t>
+      </w:r>
+      <w:r>
+        <w:rPr>
+          <w:b/>
+          <w:bCs/>
+        </w:rPr>
+        <w:t>increase</w:t>
+      </w:r>
+      <w:r>
+        <w:t xml:space="preserve"> or </w:t>
+      </w:r>
+      <w:r>
+        <w:rPr>
+          <w:b/>
+          <w:bCs/>
+        </w:rPr>
+        <w:t>decrease</w:t>
+      </w:r>
+      <w:r>
+        <w:t xml:space="preserve"> the predicted class probability).</w:t>
+      </w:r>
+    </w:p>
+    <w:p>
+      <w:pPr>
+        <w:numPr>
+          <w:ilvl w:val="0"/>
+          <w:numId w:val="10"/>
+        </w:numPr>
+      </w:pPr>
+      <w:r>
+        <w:t xml:space="preserve">Pros: very </w:t>
+      </w:r>
+      <w:r>
+        <w:rPr>
+          <w:b/>
+          <w:bCs/>
+        </w:rPr>
+        <w:t>interpretable</w:t>
+      </w:r>
+      <w:r>
+        <w:t>, quick, model-agnostic.</w:t>
+      </w:r>
+    </w:p>
+    <w:p>
+      <w:pPr>
+        <w:numPr>
+          <w:ilvl w:val="0"/>
+          <w:numId w:val="10"/>
+        </w:numPr>
+      </w:pPr>
+      <w:r>
+        <w:t xml:space="preserve">Cons: </w:t>
+      </w:r>
+      <w:r>
+        <w:rPr>
+          <w:b/>
+          <w:bCs/>
+        </w:rPr>
+        <w:t>non-stable</w:t>
+      </w:r>
+      <w:r>
+        <w:t xml:space="preserve"> if you move to a nearby point; depends on sampling &amp; discretization; no global view.</w:t>
+      </w:r>
+    </w:p>
+    <w:p>
+      <w:pPr>
+        <w:rPr>
+          <w:b/>
+          <w:bCs/>
+        </w:rPr>
+      </w:pPr>
+      <w:r>
+        <w:rPr>
+          <w:b/>
+          <w:bCs/>
+        </w:rPr>
+        <w:t>SHAP (global + local, theoretically grounded)</w:t>
+      </w:r>
+    </w:p>
+    <w:p>
+      <w:pPr>
+        <w:numPr>
+          <w:ilvl w:val="0"/>
+          <w:numId w:val="11"/>
+        </w:numPr>
+      </w:pPr>
+      <w:r>
+        <w:t xml:space="preserve">Produces </w:t>
+      </w:r>
+      <w:r>
+        <w:rPr>
+          <w:b/>
+          <w:bCs/>
+        </w:rPr>
+        <w:t>Shapley values</w:t>
+      </w:r>
+      <w:r>
+        <w:t xml:space="preserve"> that satisfy additivity &amp; consistency axioms.</w:t>
+      </w:r>
+    </w:p>
+    <w:p>
+      <w:pPr>
+        <w:numPr>
+          <w:ilvl w:val="0"/>
+          <w:numId w:val="11"/>
+        </w:numPr>
+      </w:pPr>
+      <w:r>
+        <w:rPr>
+          <w:b/>
+          <w:bCs/>
+        </w:rPr>
+        <w:t>Global summary</w:t>
+      </w:r>
+      <w:r>
+        <w:t xml:space="preserve"> (beeswarm) ranks </w:t>
+      </w:r>
+      <w:proofErr w:type="gramStart"/>
+      <w:r>
+        <w:t>features</w:t>
+      </w:r>
+      <w:proofErr w:type="gramEnd"/>
+      <w:r>
+        <w:t xml:space="preserve"> by mean |SHAP|; for RF, the top drivers were </w:t>
+      </w:r>
+      <w:r>
+        <w:rPr>
+          <w:b/>
+          <w:bCs/>
+        </w:rPr>
+        <w:t>mfcc1</w:t>
+      </w:r>
+      <w:r>
+        <w:t xml:space="preserve"> and </w:t>
+      </w:r>
+      <w:r>
+        <w:rPr>
+          <w:b/>
+          <w:bCs/>
+        </w:rPr>
+        <w:t>rms</w:t>
+      </w:r>
+      <w:r>
+        <w:t>, which matches our A4 RFE picks—good sanity check.</w:t>
+      </w:r>
+    </w:p>
+    <w:p>
+      <w:pPr>
+        <w:numPr>
+          <w:ilvl w:val="0"/>
+          <w:numId w:val="11"/>
+        </w:numPr>
+      </w:pPr>
+      <w:r>
+        <w:t>Pros: consistent, works for both global and local explanations, good for auditing.</w:t>
+      </w:r>
+    </w:p>
+    <w:p>
+      <w:pPr>
+        <w:numPr>
+          <w:ilvl w:val="0"/>
+          <w:numId w:val="11"/>
+        </w:numPr>
+      </w:pPr>
+      <w:r>
+        <w:t>Cons: heavier compute; must pick the right explainer (Tree/Linear/Kernel).</w:t>
+      </w:r>
+    </w:p>
+    <w:p>
+      <w:pPr>
+        <w:rPr>
+          <w:b/>
+          <w:bCs/>
+        </w:rPr>
+      </w:pPr>
+      <w:r>
+        <w:rPr>
+          <w:b/>
+          <w:bCs/>
+        </w:rPr>
+        <w:lastRenderedPageBreak/>
+        <w:t>When to use which</w:t>
+      </w:r>
+    </w:p>
+    <w:p>
+      <w:pPr>
+        <w:numPr>
+          <w:ilvl w:val="0"/>
+          <w:numId w:val="12"/>
+        </w:numPr>
+      </w:pPr>
+      <w:r>
+        <w:t xml:space="preserve">Use </w:t>
+      </w:r>
+      <w:r>
+        <w:rPr>
+          <w:b/>
+          <w:bCs/>
+        </w:rPr>
+        <w:t>LIME</w:t>
+      </w:r>
+      <w:r>
+        <w:t xml:space="preserve"> when you need a </w:t>
+      </w:r>
+      <w:r>
+        <w:rPr>
+          <w:b/>
+          <w:bCs/>
+        </w:rPr>
+        <w:t>quick case explanation</w:t>
+      </w:r>
+      <w:r>
+        <w:t xml:space="preserve"> for a specific prediction (e.g., why this file was classified as class 2).</w:t>
+      </w:r>
+    </w:p>
+    <w:p>
+      <w:pPr>
+        <w:numPr>
+          <w:ilvl w:val="0"/>
+          <w:numId w:val="12"/>
+        </w:numPr>
+      </w:pPr>
+      <w:r>
+        <w:t xml:space="preserve">Use </w:t>
+      </w:r>
+      <w:r>
+        <w:rPr>
+          <w:b/>
+          <w:bCs/>
+        </w:rPr>
+        <w:t>SHAP</w:t>
+      </w:r>
+      <w:r>
+        <w:t xml:space="preserve"> when you need </w:t>
+      </w:r>
+      <w:r>
+        <w:rPr>
+          <w:b/>
+          <w:bCs/>
+        </w:rPr>
+        <w:t>global understanding</w:t>
+      </w:r>
+      <w:r>
+        <w:t xml:space="preserve"> (feature importance across the dataset), or when you must rely on </w:t>
+      </w:r>
+      <w:r>
+        <w:rPr>
+          <w:b/>
+          <w:bCs/>
+        </w:rPr>
+        <w:t>theoretically consistent</w:t>
+      </w:r>
+      <w:r>
+        <w:t xml:space="preserve"> attributions.</w:t>
+      </w:r>
+    </w:p>
+    <w:p>
+      <w:pPr>
+        <w:rPr>
+          <w:b/>
+          <w:bCs/>
+        </w:rPr>
+      </w:pPr>
+      <w:r>
+        <w:rPr>
+          <w:b/>
+          <w:bCs/>
+        </w:rPr>
+        <w:t>One-line conclusion</w:t>
+      </w:r>
+    </w:p>
+    <w:p>
+      <w:r>
+        <w:t xml:space="preserve">“Both methods agree that </w:t>
+      </w:r>
+      <w:r>
+        <w:rPr>
+          <w:b/>
+          <w:bCs/>
+        </w:rPr>
+        <w:t>mfcc1</w:t>
+      </w:r>
+      <w:r>
+        <w:t xml:space="preserve"> and </w:t>
+      </w:r>
+      <w:r>
+        <w:rPr>
+          <w:b/>
+          <w:bCs/>
+        </w:rPr>
+        <w:t>rms</w:t>
+      </w:r>
+      <w:r>
+        <w:t xml:space="preserve"> dominate the model’s decisions. </w:t>
+      </w:r>
+      <w:r>
+        <w:rPr>
+          <w:b/>
+          <w:bCs/>
+        </w:rPr>
+        <w:t>LIME</w:t>
+      </w:r>
+      <w:r>
+        <w:t xml:space="preserve"> explains individual cases clearly; </w:t>
+      </w:r>
+      <w:r>
+        <w:rPr>
+          <w:b/>
+          <w:bCs/>
+        </w:rPr>
+        <w:t>SHAP</w:t>
+      </w:r>
+      <w:r>
+        <w:t xml:space="preserve"> provides a robust global view and aligns with our supervised feature selection (RFE), confirming the model’s reliance on these features.”</w:t>
+      </w:r>
+    </w:p>
+    <w:p/>
     <w:sectPr>
       <w:pgSz w:w="11906" w:h="16838"/>
       <w:pgMar w:top="1440" w:right="1440" w:bottom="1440" w:left="1440" w:header="708" w:footer="708" w:gutter="0"/>
@@ -1653,6 +2630,304 @@
     </w:lvl>
   </w:abstractNum>
   <w:abstractNum w:abstractNumId="1" w15:restartNumberingAfterBreak="0">
+    <w:nsid w:val="04FA21D7"/>
+    <w:multiLevelType w:val="multilevel"/>
+    <w:tmpl w:val="E506BBCC"/>
+    <w:lvl w:ilvl="0">
+      <w:start w:val="1"/>
+      <w:numFmt w:val="bullet"/>
+      <w:lvlText w:val=""/>
+      <w:lvlJc w:val="left"/>
+      <w:pPr>
+        <w:tabs>
+          <w:tab w:val="num" w:pos="720"/>
+        </w:tabs>
+        <w:ind w:left="720" w:hanging="360"/>
+      </w:pPr>
+      <w:rPr>
+        <w:rFonts w:ascii="Symbol" w:hAnsi="Symbol" w:hint="default"/>
+        <w:sz w:val="20"/>
+      </w:rPr>
+    </w:lvl>
+    <w:lvl w:ilvl="1">
+      <w:start w:val="1"/>
+      <w:numFmt w:val="bullet"/>
+      <w:lvlText w:val="o"/>
+      <w:lvlJc w:val="left"/>
+      <w:pPr>
+        <w:tabs>
+          <w:tab w:val="num" w:pos="1440"/>
+        </w:tabs>
+        <w:ind w:left="1440" w:hanging="360"/>
+      </w:pPr>
+      <w:rPr>
+        <w:rFonts w:ascii="Courier New" w:hAnsi="Courier New" w:hint="default"/>
+        <w:sz w:val="20"/>
+      </w:rPr>
+    </w:lvl>
+    <w:lvl w:ilvl="2" w:tentative="1">
+      <w:start w:val="1"/>
+      <w:numFmt w:val="bullet"/>
+      <w:lvlText w:val=""/>
+      <w:lvlJc w:val="left"/>
+      <w:pPr>
+        <w:tabs>
+          <w:tab w:val="num" w:pos="2160"/>
+        </w:tabs>
+        <w:ind w:left="2160" w:hanging="360"/>
+      </w:pPr>
+      <w:rPr>
+        <w:rFonts w:ascii="Wingdings" w:hAnsi="Wingdings" w:hint="default"/>
+        <w:sz w:val="20"/>
+      </w:rPr>
+    </w:lvl>
+    <w:lvl w:ilvl="3" w:tentative="1">
+      <w:start w:val="1"/>
+      <w:numFmt w:val="bullet"/>
+      <w:lvlText w:val=""/>
+      <w:lvlJc w:val="left"/>
+      <w:pPr>
+        <w:tabs>
+          <w:tab w:val="num" w:pos="2880"/>
+        </w:tabs>
+        <w:ind w:left="2880" w:hanging="360"/>
+      </w:pPr>
+      <w:rPr>
+        <w:rFonts w:ascii="Wingdings" w:hAnsi="Wingdings" w:hint="default"/>
+        <w:sz w:val="20"/>
+      </w:rPr>
+    </w:lvl>
+    <w:lvl w:ilvl="4" w:tentative="1">
+      <w:start w:val="1"/>
+      <w:numFmt w:val="bullet"/>
+      <w:lvlText w:val=""/>
+      <w:lvlJc w:val="left"/>
+      <w:pPr>
+        <w:tabs>
+          <w:tab w:val="num" w:pos="3600"/>
+        </w:tabs>
+        <w:ind w:left="3600" w:hanging="360"/>
+      </w:pPr>
+      <w:rPr>
+        <w:rFonts w:ascii="Wingdings" w:hAnsi="Wingdings" w:hint="default"/>
+        <w:sz w:val="20"/>
+      </w:rPr>
+    </w:lvl>
+    <w:lvl w:ilvl="5" w:tentative="1">
+      <w:start w:val="1"/>
+      <w:numFmt w:val="bullet"/>
+      <w:lvlText w:val=""/>
+      <w:lvlJc w:val="left"/>
+      <w:pPr>
+        <w:tabs>
+          <w:tab w:val="num" w:pos="4320"/>
+        </w:tabs>
+        <w:ind w:left="4320" w:hanging="360"/>
+      </w:pPr>
+      <w:rPr>
+        <w:rFonts w:ascii="Wingdings" w:hAnsi="Wingdings" w:hint="default"/>
+        <w:sz w:val="20"/>
+      </w:rPr>
+    </w:lvl>
+    <w:lvl w:ilvl="6" w:tentative="1">
+      <w:start w:val="1"/>
+      <w:numFmt w:val="bullet"/>
+      <w:lvlText w:val=""/>
+      <w:lvlJc w:val="left"/>
+      <w:pPr>
+        <w:tabs>
+          <w:tab w:val="num" w:pos="5040"/>
+        </w:tabs>
+        <w:ind w:left="5040" w:hanging="360"/>
+      </w:pPr>
+      <w:rPr>
+        <w:rFonts w:ascii="Wingdings" w:hAnsi="Wingdings" w:hint="default"/>
+        <w:sz w:val="20"/>
+      </w:rPr>
+    </w:lvl>
+    <w:lvl w:ilvl="7" w:tentative="1">
+      <w:start w:val="1"/>
+      <w:numFmt w:val="bullet"/>
+      <w:lvlText w:val=""/>
+      <w:lvlJc w:val="left"/>
+      <w:pPr>
+        <w:tabs>
+          <w:tab w:val="num" w:pos="5760"/>
+        </w:tabs>
+        <w:ind w:left="5760" w:hanging="360"/>
+      </w:pPr>
+      <w:rPr>
+        <w:rFonts w:ascii="Wingdings" w:hAnsi="Wingdings" w:hint="default"/>
+        <w:sz w:val="20"/>
+      </w:rPr>
+    </w:lvl>
+    <w:lvl w:ilvl="8" w:tentative="1">
+      <w:start w:val="1"/>
+      <w:numFmt w:val="bullet"/>
+      <w:lvlText w:val=""/>
+      <w:lvlJc w:val="left"/>
+      <w:pPr>
+        <w:tabs>
+          <w:tab w:val="num" w:pos="6480"/>
+        </w:tabs>
+        <w:ind w:left="6480" w:hanging="360"/>
+      </w:pPr>
+      <w:rPr>
+        <w:rFonts w:ascii="Wingdings" w:hAnsi="Wingdings" w:hint="default"/>
+        <w:sz w:val="20"/>
+      </w:rPr>
+    </w:lvl>
+  </w:abstractNum>
+  <w:abstractNum w:abstractNumId="2" w15:restartNumberingAfterBreak="0">
+    <w:nsid w:val="081F42BD"/>
+    <w:multiLevelType w:val="multilevel"/>
+    <w:tmpl w:val="1D94F62C"/>
+    <w:lvl w:ilvl="0">
+      <w:start w:val="1"/>
+      <w:numFmt w:val="bullet"/>
+      <w:lvlText w:val=""/>
+      <w:lvlJc w:val="left"/>
+      <w:pPr>
+        <w:tabs>
+          <w:tab w:val="num" w:pos="720"/>
+        </w:tabs>
+        <w:ind w:left="720" w:hanging="360"/>
+      </w:pPr>
+      <w:rPr>
+        <w:rFonts w:ascii="Symbol" w:hAnsi="Symbol" w:hint="default"/>
+        <w:sz w:val="20"/>
+      </w:rPr>
+    </w:lvl>
+    <w:lvl w:ilvl="1" w:tentative="1">
+      <w:start w:val="1"/>
+      <w:numFmt w:val="bullet"/>
+      <w:lvlText w:val="o"/>
+      <w:lvlJc w:val="left"/>
+      <w:pPr>
+        <w:tabs>
+          <w:tab w:val="num" w:pos="1440"/>
+        </w:tabs>
+        <w:ind w:left="1440" w:hanging="360"/>
+      </w:pPr>
+      <w:rPr>
+        <w:rFonts w:ascii="Courier New" w:hAnsi="Courier New" w:hint="default"/>
+        <w:sz w:val="20"/>
+      </w:rPr>
+    </w:lvl>
+    <w:lvl w:ilvl="2" w:tentative="1">
+      <w:start w:val="1"/>
+      <w:numFmt w:val="bullet"/>
+      <w:lvlText w:val=""/>
+      <w:lvlJc w:val="left"/>
+      <w:pPr>
+        <w:tabs>
+          <w:tab w:val="num" w:pos="2160"/>
+        </w:tabs>
+        <w:ind w:left="2160" w:hanging="360"/>
+      </w:pPr>
+      <w:rPr>
+        <w:rFonts w:ascii="Wingdings" w:hAnsi="Wingdings" w:hint="default"/>
+        <w:sz w:val="20"/>
+      </w:rPr>
+    </w:lvl>
+    <w:lvl w:ilvl="3" w:tentative="1">
+      <w:start w:val="1"/>
+      <w:numFmt w:val="bullet"/>
+      <w:lvlText w:val=""/>
+      <w:lvlJc w:val="left"/>
+      <w:pPr>
+        <w:tabs>
+          <w:tab w:val="num" w:pos="2880"/>
+        </w:tabs>
+        <w:ind w:left="2880" w:hanging="360"/>
+      </w:pPr>
+      <w:rPr>
+        <w:rFonts w:ascii="Wingdings" w:hAnsi="Wingdings" w:hint="default"/>
+        <w:sz w:val="20"/>
+      </w:rPr>
+    </w:lvl>
+    <w:lvl w:ilvl="4" w:tentative="1">
+      <w:start w:val="1"/>
+      <w:numFmt w:val="bullet"/>
+      <w:lvlText w:val=""/>
+      <w:lvlJc w:val="left"/>
+      <w:pPr>
+        <w:tabs>
+          <w:tab w:val="num" w:pos="3600"/>
+        </w:tabs>
+        <w:ind w:left="3600" w:hanging="360"/>
+      </w:pPr>
+      <w:rPr>
+        <w:rFonts w:ascii="Wingdings" w:hAnsi="Wingdings" w:hint="default"/>
+        <w:sz w:val="20"/>
+      </w:rPr>
+    </w:lvl>
+    <w:lvl w:ilvl="5" w:tentative="1">
+      <w:start w:val="1"/>
+      <w:numFmt w:val="bullet"/>
+      <w:lvlText w:val=""/>
+      <w:lvlJc w:val="left"/>
+      <w:pPr>
+        <w:tabs>
+          <w:tab w:val="num" w:pos="4320"/>
+        </w:tabs>
+        <w:ind w:left="4320" w:hanging="360"/>
+      </w:pPr>
+      <w:rPr>
+        <w:rFonts w:ascii="Wingdings" w:hAnsi="Wingdings" w:hint="default"/>
+        <w:sz w:val="20"/>
+      </w:rPr>
+    </w:lvl>
+    <w:lvl w:ilvl="6" w:tentative="1">
+      <w:start w:val="1"/>
+      <w:numFmt w:val="bullet"/>
+      <w:lvlText w:val=""/>
+      <w:lvlJc w:val="left"/>
+      <w:pPr>
+        <w:tabs>
+          <w:tab w:val="num" w:pos="5040"/>
+        </w:tabs>
+        <w:ind w:left="5040" w:hanging="360"/>
+      </w:pPr>
+      <w:rPr>
+        <w:rFonts w:ascii="Wingdings" w:hAnsi="Wingdings" w:hint="default"/>
+        <w:sz w:val="20"/>
+      </w:rPr>
+    </w:lvl>
+    <w:lvl w:ilvl="7" w:tentative="1">
+      <w:start w:val="1"/>
+      <w:numFmt w:val="bullet"/>
+      <w:lvlText w:val=""/>
+      <w:lvlJc w:val="left"/>
+      <w:pPr>
+        <w:tabs>
+          <w:tab w:val="num" w:pos="5760"/>
+        </w:tabs>
+        <w:ind w:left="5760" w:hanging="360"/>
+      </w:pPr>
+      <w:rPr>
+        <w:rFonts w:ascii="Wingdings" w:hAnsi="Wingdings" w:hint="default"/>
+        <w:sz w:val="20"/>
+      </w:rPr>
+    </w:lvl>
+    <w:lvl w:ilvl="8" w:tentative="1">
+      <w:start w:val="1"/>
+      <w:numFmt w:val="bullet"/>
+      <w:lvlText w:val=""/>
+      <w:lvlJc w:val="left"/>
+      <w:pPr>
+        <w:tabs>
+          <w:tab w:val="num" w:pos="6480"/>
+        </w:tabs>
+        <w:ind w:left="6480" w:hanging="360"/>
+      </w:pPr>
+      <w:rPr>
+        <w:rFonts w:ascii="Wingdings" w:hAnsi="Wingdings" w:hint="default"/>
+        <w:sz w:val="20"/>
+      </w:rPr>
+    </w:lvl>
+  </w:abstractNum>
+  <w:abstractNum w:abstractNumId="3" w15:restartNumberingAfterBreak="0">
     <w:nsid w:val="1F680C27"/>
     <w:multiLevelType w:val="multilevel"/>
     <w:tmpl w:val="EEBA1C44"/>
@@ -1801,7 +3076,156 @@
       </w:rPr>
     </w:lvl>
   </w:abstractNum>
-  <w:abstractNum w:abstractNumId="2" w15:restartNumberingAfterBreak="0">
+  <w:abstractNum w:abstractNumId="4" w15:restartNumberingAfterBreak="0">
+    <w:nsid w:val="37E92B5C"/>
+    <w:multiLevelType w:val="multilevel"/>
+    <w:tmpl w:val="57E429A8"/>
+    <w:lvl w:ilvl="0">
+      <w:start w:val="1"/>
+      <w:numFmt w:val="bullet"/>
+      <w:lvlText w:val=""/>
+      <w:lvlJc w:val="left"/>
+      <w:pPr>
+        <w:tabs>
+          <w:tab w:val="num" w:pos="720"/>
+        </w:tabs>
+        <w:ind w:left="720" w:hanging="360"/>
+      </w:pPr>
+      <w:rPr>
+        <w:rFonts w:ascii="Symbol" w:hAnsi="Symbol" w:hint="default"/>
+        <w:sz w:val="20"/>
+      </w:rPr>
+    </w:lvl>
+    <w:lvl w:ilvl="1" w:tentative="1">
+      <w:start w:val="1"/>
+      <w:numFmt w:val="bullet"/>
+      <w:lvlText w:val="o"/>
+      <w:lvlJc w:val="left"/>
+      <w:pPr>
+        <w:tabs>
+          <w:tab w:val="num" w:pos="1440"/>
+        </w:tabs>
+        <w:ind w:left="1440" w:hanging="360"/>
+      </w:pPr>
+      <w:rPr>
+        <w:rFonts w:ascii="Courier New" w:hAnsi="Courier New" w:hint="default"/>
+        <w:sz w:val="20"/>
+      </w:rPr>
+    </w:lvl>
+    <w:lvl w:ilvl="2" w:tentative="1">
+      <w:start w:val="1"/>
+      <w:numFmt w:val="bullet"/>
+      <w:lvlText w:val=""/>
+      <w:lvlJc w:val="left"/>
+      <w:pPr>
+        <w:tabs>
+          <w:tab w:val="num" w:pos="2160"/>
+        </w:tabs>
+        <w:ind w:left="2160" w:hanging="360"/>
+      </w:pPr>
+      <w:rPr>
+        <w:rFonts w:ascii="Wingdings" w:hAnsi="Wingdings" w:hint="default"/>
+        <w:sz w:val="20"/>
+      </w:rPr>
+    </w:lvl>
+    <w:lvl w:ilvl="3" w:tentative="1">
+      <w:start w:val="1"/>
+      <w:numFmt w:val="bullet"/>
+      <w:lvlText w:val=""/>
+      <w:lvlJc w:val="left"/>
+      <w:pPr>
+        <w:tabs>
+          <w:tab w:val="num" w:pos="2880"/>
+        </w:tabs>
+        <w:ind w:left="2880" w:hanging="360"/>
+      </w:pPr>
+      <w:rPr>
+        <w:rFonts w:ascii="Wingdings" w:hAnsi="Wingdings" w:hint="default"/>
+        <w:sz w:val="20"/>
+      </w:rPr>
+    </w:lvl>
+    <w:lvl w:ilvl="4" w:tentative="1">
+      <w:start w:val="1"/>
+      <w:numFmt w:val="bullet"/>
+      <w:lvlText w:val=""/>
+      <w:lvlJc w:val="left"/>
+      <w:pPr>
+        <w:tabs>
+          <w:tab w:val="num" w:pos="3600"/>
+        </w:tabs>
+        <w:ind w:left="3600" w:hanging="360"/>
+      </w:pPr>
+      <w:rPr>
+        <w:rFonts w:ascii="Wingdings" w:hAnsi="Wingdings" w:hint="default"/>
+        <w:sz w:val="20"/>
+      </w:rPr>
+    </w:lvl>
+    <w:lvl w:ilvl="5" w:tentative="1">
+      <w:start w:val="1"/>
+      <w:numFmt w:val="bullet"/>
+      <w:lvlText w:val=""/>
+      <w:lvlJc w:val="left"/>
+      <w:pPr>
+        <w:tabs>
+          <w:tab w:val="num" w:pos="4320"/>
+        </w:tabs>
+        <w:ind w:left="4320" w:hanging="360"/>
+      </w:pPr>
+      <w:rPr>
+        <w:rFonts w:ascii="Wingdings" w:hAnsi="Wingdings" w:hint="default"/>
+        <w:sz w:val="20"/>
+      </w:rPr>
+    </w:lvl>
+    <w:lvl w:ilvl="6" w:tentative="1">
+      <w:start w:val="1"/>
+      <w:numFmt w:val="bullet"/>
+      <w:lvlText w:val=""/>
+      <w:lvlJc w:val="left"/>
+      <w:pPr>
+        <w:tabs>
+          <w:tab w:val="num" w:pos="5040"/>
+        </w:tabs>
+        <w:ind w:left="5040" w:hanging="360"/>
+      </w:pPr>
+      <w:rPr>
+        <w:rFonts w:ascii="Wingdings" w:hAnsi="Wingdings" w:hint="default"/>
+        <w:sz w:val="20"/>
+      </w:rPr>
+    </w:lvl>
+    <w:lvl w:ilvl="7" w:tentative="1">
+      <w:start w:val="1"/>
+      <w:numFmt w:val="bullet"/>
+      <w:lvlText w:val=""/>
+      <w:lvlJc w:val="left"/>
+      <w:pPr>
+        <w:tabs>
+          <w:tab w:val="num" w:pos="5760"/>
+        </w:tabs>
+        <w:ind w:left="5760" w:hanging="360"/>
+      </w:pPr>
+      <w:rPr>
+        <w:rFonts w:ascii="Wingdings" w:hAnsi="Wingdings" w:hint="default"/>
+        <w:sz w:val="20"/>
+      </w:rPr>
+    </w:lvl>
+    <w:lvl w:ilvl="8" w:tentative="1">
+      <w:start w:val="1"/>
+      <w:numFmt w:val="bullet"/>
+      <w:lvlText w:val=""/>
+      <w:lvlJc w:val="left"/>
+      <w:pPr>
+        <w:tabs>
+          <w:tab w:val="num" w:pos="6480"/>
+        </w:tabs>
+        <w:ind w:left="6480" w:hanging="360"/>
+      </w:pPr>
+      <w:rPr>
+        <w:rFonts w:ascii="Wingdings" w:hAnsi="Wingdings" w:hint="default"/>
+        <w:sz w:val="20"/>
+      </w:rPr>
+    </w:lvl>
+  </w:abstractNum>
+  <w:abstractNum w:abstractNumId="5" w15:restartNumberingAfterBreak="0">
     <w:nsid w:val="455D3EED"/>
     <w:multiLevelType w:val="multilevel"/>
     <w:tmpl w:val="955C54F2"/>
@@ -1950,7 +3374,7 @@
       </w:rPr>
     </w:lvl>
   </w:abstractNum>
-  <w:abstractNum w:abstractNumId="3" w15:restartNumberingAfterBreak="0">
+  <w:abstractNum w:abstractNumId="6" w15:restartNumberingAfterBreak="0">
     <w:nsid w:val="54714BC9"/>
     <w:multiLevelType w:val="multilevel"/>
     <w:tmpl w:val="51DCD5E6"/>
@@ -2099,7 +3523,7 @@
       </w:rPr>
     </w:lvl>
   </w:abstractNum>
-  <w:abstractNum w:abstractNumId="4" w15:restartNumberingAfterBreak="0">
+  <w:abstractNum w:abstractNumId="7" w15:restartNumberingAfterBreak="0">
     <w:nsid w:val="5C6728B2"/>
     <w:multiLevelType w:val="multilevel"/>
     <w:tmpl w:val="BED23592"/>
@@ -2248,7 +3672,454 @@
       </w:rPr>
     </w:lvl>
   </w:abstractNum>
-  <w:abstractNum w:abstractNumId="5" w15:restartNumberingAfterBreak="0">
+  <w:abstractNum w:abstractNumId="8" w15:restartNumberingAfterBreak="0">
+    <w:nsid w:val="6D342E27"/>
+    <w:multiLevelType w:val="multilevel"/>
+    <w:tmpl w:val="B5FACD64"/>
+    <w:lvl w:ilvl="0">
+      <w:start w:val="1"/>
+      <w:numFmt w:val="bullet"/>
+      <w:lvlText w:val=""/>
+      <w:lvlJc w:val="left"/>
+      <w:pPr>
+        <w:tabs>
+          <w:tab w:val="num" w:pos="720"/>
+        </w:tabs>
+        <w:ind w:left="720" w:hanging="360"/>
+      </w:pPr>
+      <w:rPr>
+        <w:rFonts w:ascii="Symbol" w:hAnsi="Symbol" w:hint="default"/>
+        <w:sz w:val="20"/>
+      </w:rPr>
+    </w:lvl>
+    <w:lvl w:ilvl="1" w:tentative="1">
+      <w:start w:val="1"/>
+      <w:numFmt w:val="bullet"/>
+      <w:lvlText w:val="o"/>
+      <w:lvlJc w:val="left"/>
+      <w:pPr>
+        <w:tabs>
+          <w:tab w:val="num" w:pos="1440"/>
+        </w:tabs>
+        <w:ind w:left="1440" w:hanging="360"/>
+      </w:pPr>
+      <w:rPr>
+        <w:rFonts w:ascii="Courier New" w:hAnsi="Courier New" w:hint="default"/>
+        <w:sz w:val="20"/>
+      </w:rPr>
+    </w:lvl>
+    <w:lvl w:ilvl="2" w:tentative="1">
+      <w:start w:val="1"/>
+      <w:numFmt w:val="bullet"/>
+      <w:lvlText w:val=""/>
+      <w:lvlJc w:val="left"/>
+      <w:pPr>
+        <w:tabs>
+          <w:tab w:val="num" w:pos="2160"/>
+        </w:tabs>
+        <w:ind w:left="2160" w:hanging="360"/>
+      </w:pPr>
+      <w:rPr>
+        <w:rFonts w:ascii="Wingdings" w:hAnsi="Wingdings" w:hint="default"/>
+        <w:sz w:val="20"/>
+      </w:rPr>
+    </w:lvl>
+    <w:lvl w:ilvl="3" w:tentative="1">
+      <w:start w:val="1"/>
+      <w:numFmt w:val="bullet"/>
+      <w:lvlText w:val=""/>
+      <w:lvlJc w:val="left"/>
+      <w:pPr>
+        <w:tabs>
+          <w:tab w:val="num" w:pos="2880"/>
+        </w:tabs>
+        <w:ind w:left="2880" w:hanging="360"/>
+      </w:pPr>
+      <w:rPr>
+        <w:rFonts w:ascii="Wingdings" w:hAnsi="Wingdings" w:hint="default"/>
+        <w:sz w:val="20"/>
+      </w:rPr>
+    </w:lvl>
+    <w:lvl w:ilvl="4" w:tentative="1">
+      <w:start w:val="1"/>
+      <w:numFmt w:val="bullet"/>
+      <w:lvlText w:val=""/>
+      <w:lvlJc w:val="left"/>
+      <w:pPr>
+        <w:tabs>
+          <w:tab w:val="num" w:pos="3600"/>
+        </w:tabs>
+        <w:ind w:left="3600" w:hanging="360"/>
+      </w:pPr>
+      <w:rPr>
+        <w:rFonts w:ascii="Wingdings" w:hAnsi="Wingdings" w:hint="default"/>
+        <w:sz w:val="20"/>
+      </w:rPr>
+    </w:lvl>
+    <w:lvl w:ilvl="5" w:tentative="1">
+      <w:start w:val="1"/>
+      <w:numFmt w:val="bullet"/>
+      <w:lvlText w:val=""/>
+      <w:lvlJc w:val="left"/>
+      <w:pPr>
+        <w:tabs>
+          <w:tab w:val="num" w:pos="4320"/>
+        </w:tabs>
+        <w:ind w:left="4320" w:hanging="360"/>
+      </w:pPr>
+      <w:rPr>
+        <w:rFonts w:ascii="Wingdings" w:hAnsi="Wingdings" w:hint="default"/>
+        <w:sz w:val="20"/>
+      </w:rPr>
+    </w:lvl>
+    <w:lvl w:ilvl="6" w:tentative="1">
+      <w:start w:val="1"/>
+      <w:numFmt w:val="bullet"/>
+      <w:lvlText w:val=""/>
+      <w:lvlJc w:val="left"/>
+      <w:pPr>
+        <w:tabs>
+          <w:tab w:val="num" w:pos="5040"/>
+        </w:tabs>
+        <w:ind w:left="5040" w:hanging="360"/>
+      </w:pPr>
+      <w:rPr>
+        <w:rFonts w:ascii="Wingdings" w:hAnsi="Wingdings" w:hint="default"/>
+        <w:sz w:val="20"/>
+      </w:rPr>
+    </w:lvl>
+    <w:lvl w:ilvl="7" w:tentative="1">
+      <w:start w:val="1"/>
+      <w:numFmt w:val="bullet"/>
+      <w:lvlText w:val=""/>
+      <w:lvlJc w:val="left"/>
+      <w:pPr>
+        <w:tabs>
+          <w:tab w:val="num" w:pos="5760"/>
+        </w:tabs>
+        <w:ind w:left="5760" w:hanging="360"/>
+      </w:pPr>
+      <w:rPr>
+        <w:rFonts w:ascii="Wingdings" w:hAnsi="Wingdings" w:hint="default"/>
+        <w:sz w:val="20"/>
+      </w:rPr>
+    </w:lvl>
+    <w:lvl w:ilvl="8" w:tentative="1">
+      <w:start w:val="1"/>
+      <w:numFmt w:val="bullet"/>
+      <w:lvlText w:val=""/>
+      <w:lvlJc w:val="left"/>
+      <w:pPr>
+        <w:tabs>
+          <w:tab w:val="num" w:pos="6480"/>
+        </w:tabs>
+        <w:ind w:left="6480" w:hanging="360"/>
+      </w:pPr>
+      <w:rPr>
+        <w:rFonts w:ascii="Wingdings" w:hAnsi="Wingdings" w:hint="default"/>
+        <w:sz w:val="20"/>
+      </w:rPr>
+    </w:lvl>
+  </w:abstractNum>
+  <w:abstractNum w:abstractNumId="9" w15:restartNumberingAfterBreak="0">
+    <w:nsid w:val="6EBC6FDE"/>
+    <w:multiLevelType w:val="multilevel"/>
+    <w:tmpl w:val="D3087786"/>
+    <w:lvl w:ilvl="0">
+      <w:start w:val="1"/>
+      <w:numFmt w:val="bullet"/>
+      <w:lvlText w:val=""/>
+      <w:lvlJc w:val="left"/>
+      <w:pPr>
+        <w:tabs>
+          <w:tab w:val="num" w:pos="720"/>
+        </w:tabs>
+        <w:ind w:left="720" w:hanging="360"/>
+      </w:pPr>
+      <w:rPr>
+        <w:rFonts w:ascii="Symbol" w:hAnsi="Symbol" w:hint="default"/>
+        <w:sz w:val="20"/>
+      </w:rPr>
+    </w:lvl>
+    <w:lvl w:ilvl="1" w:tentative="1">
+      <w:start w:val="1"/>
+      <w:numFmt w:val="bullet"/>
+      <w:lvlText w:val="o"/>
+      <w:lvlJc w:val="left"/>
+      <w:pPr>
+        <w:tabs>
+          <w:tab w:val="num" w:pos="1440"/>
+        </w:tabs>
+        <w:ind w:left="1440" w:hanging="360"/>
+      </w:pPr>
+      <w:rPr>
+        <w:rFonts w:ascii="Courier New" w:hAnsi="Courier New" w:hint="default"/>
+        <w:sz w:val="20"/>
+      </w:rPr>
+    </w:lvl>
+    <w:lvl w:ilvl="2" w:tentative="1">
+      <w:start w:val="1"/>
+      <w:numFmt w:val="bullet"/>
+      <w:lvlText w:val=""/>
+      <w:lvlJc w:val="left"/>
+      <w:pPr>
+        <w:tabs>
+          <w:tab w:val="num" w:pos="2160"/>
+        </w:tabs>
+        <w:ind w:left="2160" w:hanging="360"/>
+      </w:pPr>
+      <w:rPr>
+        <w:rFonts w:ascii="Wingdings" w:hAnsi="Wingdings" w:hint="default"/>
+        <w:sz w:val="20"/>
+      </w:rPr>
+    </w:lvl>
+    <w:lvl w:ilvl="3" w:tentative="1">
+      <w:start w:val="1"/>
+      <w:numFmt w:val="bullet"/>
+      <w:lvlText w:val=""/>
+      <w:lvlJc w:val="left"/>
+      <w:pPr>
+        <w:tabs>
+          <w:tab w:val="num" w:pos="2880"/>
+        </w:tabs>
+        <w:ind w:left="2880" w:hanging="360"/>
+      </w:pPr>
+      <w:rPr>
+        <w:rFonts w:ascii="Wingdings" w:hAnsi="Wingdings" w:hint="default"/>
+        <w:sz w:val="20"/>
+      </w:rPr>
+    </w:lvl>
+    <w:lvl w:ilvl="4" w:tentative="1">
+      <w:start w:val="1"/>
+      <w:numFmt w:val="bullet"/>
+      <w:lvlText w:val=""/>
+      <w:lvlJc w:val="left"/>
+      <w:pPr>
+        <w:tabs>
+          <w:tab w:val="num" w:pos="3600"/>
+        </w:tabs>
+        <w:ind w:left="3600" w:hanging="360"/>
+      </w:pPr>
+      <w:rPr>
+        <w:rFonts w:ascii="Wingdings" w:hAnsi="Wingdings" w:hint="default"/>
+        <w:sz w:val="20"/>
+      </w:rPr>
+    </w:lvl>
+    <w:lvl w:ilvl="5" w:tentative="1">
+      <w:start w:val="1"/>
+      <w:numFmt w:val="bullet"/>
+      <w:lvlText w:val=""/>
+      <w:lvlJc w:val="left"/>
+      <w:pPr>
+        <w:tabs>
+          <w:tab w:val="num" w:pos="4320"/>
+        </w:tabs>
+        <w:ind w:left="4320" w:hanging="360"/>
+      </w:pPr>
+      <w:rPr>
+        <w:rFonts w:ascii="Wingdings" w:hAnsi="Wingdings" w:hint="default"/>
+        <w:sz w:val="20"/>
+      </w:rPr>
+    </w:lvl>
+    <w:lvl w:ilvl="6" w:tentative="1">
+      <w:start w:val="1"/>
+      <w:numFmt w:val="bullet"/>
+      <w:lvlText w:val=""/>
+      <w:lvlJc w:val="left"/>
+      <w:pPr>
+        <w:tabs>
+          <w:tab w:val="num" w:pos="5040"/>
+        </w:tabs>
+        <w:ind w:left="5040" w:hanging="360"/>
+      </w:pPr>
+      <w:rPr>
+        <w:rFonts w:ascii="Wingdings" w:hAnsi="Wingdings" w:hint="default"/>
+        <w:sz w:val="20"/>
+      </w:rPr>
+    </w:lvl>
+    <w:lvl w:ilvl="7" w:tentative="1">
+      <w:start w:val="1"/>
+      <w:numFmt w:val="bullet"/>
+      <w:lvlText w:val=""/>
+      <w:lvlJc w:val="left"/>
+      <w:pPr>
+        <w:tabs>
+          <w:tab w:val="num" w:pos="5760"/>
+        </w:tabs>
+        <w:ind w:left="5760" w:hanging="360"/>
+      </w:pPr>
+      <w:rPr>
+        <w:rFonts w:ascii="Wingdings" w:hAnsi="Wingdings" w:hint="default"/>
+        <w:sz w:val="20"/>
+      </w:rPr>
+    </w:lvl>
+    <w:lvl w:ilvl="8" w:tentative="1">
+      <w:start w:val="1"/>
+      <w:numFmt w:val="bullet"/>
+      <w:lvlText w:val=""/>
+      <w:lvlJc w:val="left"/>
+      <w:pPr>
+        <w:tabs>
+          <w:tab w:val="num" w:pos="6480"/>
+        </w:tabs>
+        <w:ind w:left="6480" w:hanging="360"/>
+      </w:pPr>
+      <w:rPr>
+        <w:rFonts w:ascii="Wingdings" w:hAnsi="Wingdings" w:hint="default"/>
+        <w:sz w:val="20"/>
+      </w:rPr>
+    </w:lvl>
+  </w:abstractNum>
+  <w:abstractNum w:abstractNumId="10" w15:restartNumberingAfterBreak="0">
+    <w:nsid w:val="72822FEA"/>
+    <w:multiLevelType w:val="multilevel"/>
+    <w:tmpl w:val="D0C24168"/>
+    <w:lvl w:ilvl="0">
+      <w:start w:val="1"/>
+      <w:numFmt w:val="bullet"/>
+      <w:lvlText w:val=""/>
+      <w:lvlJc w:val="left"/>
+      <w:pPr>
+        <w:tabs>
+          <w:tab w:val="num" w:pos="720"/>
+        </w:tabs>
+        <w:ind w:left="720" w:hanging="360"/>
+      </w:pPr>
+      <w:rPr>
+        <w:rFonts w:ascii="Symbol" w:hAnsi="Symbol" w:hint="default"/>
+        <w:sz w:val="20"/>
+      </w:rPr>
+    </w:lvl>
+    <w:lvl w:ilvl="1" w:tentative="1">
+      <w:start w:val="1"/>
+      <w:numFmt w:val="bullet"/>
+      <w:lvlText w:val="o"/>
+      <w:lvlJc w:val="left"/>
+      <w:pPr>
+        <w:tabs>
+          <w:tab w:val="num" w:pos="1440"/>
+        </w:tabs>
+        <w:ind w:left="1440" w:hanging="360"/>
+      </w:pPr>
+      <w:rPr>
+        <w:rFonts w:ascii="Courier New" w:hAnsi="Courier New" w:hint="default"/>
+        <w:sz w:val="20"/>
+      </w:rPr>
+    </w:lvl>
+    <w:lvl w:ilvl="2" w:tentative="1">
+      <w:start w:val="1"/>
+      <w:numFmt w:val="bullet"/>
+      <w:lvlText w:val=""/>
+      <w:lvlJc w:val="left"/>
+      <w:pPr>
+        <w:tabs>
+          <w:tab w:val="num" w:pos="2160"/>
+        </w:tabs>
+        <w:ind w:left="2160" w:hanging="360"/>
+      </w:pPr>
+      <w:rPr>
+        <w:rFonts w:ascii="Wingdings" w:hAnsi="Wingdings" w:hint="default"/>
+        <w:sz w:val="20"/>
+      </w:rPr>
+    </w:lvl>
+    <w:lvl w:ilvl="3" w:tentative="1">
+      <w:start w:val="1"/>
+      <w:numFmt w:val="bullet"/>
+      <w:lvlText w:val=""/>
+      <w:lvlJc w:val="left"/>
+      <w:pPr>
+        <w:tabs>
+          <w:tab w:val="num" w:pos="2880"/>
+        </w:tabs>
+        <w:ind w:left="2880" w:hanging="360"/>
+      </w:pPr>
+      <w:rPr>
+        <w:rFonts w:ascii="Wingdings" w:hAnsi="Wingdings" w:hint="default"/>
+        <w:sz w:val="20"/>
+      </w:rPr>
+    </w:lvl>
+    <w:lvl w:ilvl="4" w:tentative="1">
+      <w:start w:val="1"/>
+      <w:numFmt w:val="bullet"/>
+      <w:lvlText w:val=""/>
+      <w:lvlJc w:val="left"/>
+      <w:pPr>
+        <w:tabs>
+          <w:tab w:val="num" w:pos="3600"/>
+        </w:tabs>
+        <w:ind w:left="3600" w:hanging="360"/>
+      </w:pPr>
+      <w:rPr>
+        <w:rFonts w:ascii="Wingdings" w:hAnsi="Wingdings" w:hint="default"/>
+        <w:sz w:val="20"/>
+      </w:rPr>
+    </w:lvl>
+    <w:lvl w:ilvl="5" w:tentative="1">
+      <w:start w:val="1"/>
+      <w:numFmt w:val="bullet"/>
+      <w:lvlText w:val=""/>
+      <w:lvlJc w:val="left"/>
+      <w:pPr>
+        <w:tabs>
+          <w:tab w:val="num" w:pos="4320"/>
+        </w:tabs>
+        <w:ind w:left="4320" w:hanging="360"/>
+      </w:pPr>
+      <w:rPr>
+        <w:rFonts w:ascii="Wingdings" w:hAnsi="Wingdings" w:hint="default"/>
+        <w:sz w:val="20"/>
+      </w:rPr>
+    </w:lvl>
+    <w:lvl w:ilvl="6" w:tentative="1">
+      <w:start w:val="1"/>
+      <w:numFmt w:val="bullet"/>
+      <w:lvlText w:val=""/>
+      <w:lvlJc w:val="left"/>
+      <w:pPr>
+        <w:tabs>
+          <w:tab w:val="num" w:pos="5040"/>
+        </w:tabs>
+        <w:ind w:left="5040" w:hanging="360"/>
+      </w:pPr>
+      <w:rPr>
+        <w:rFonts w:ascii="Wingdings" w:hAnsi="Wingdings" w:hint="default"/>
+        <w:sz w:val="20"/>
+      </w:rPr>
+    </w:lvl>
+    <w:lvl w:ilvl="7" w:tentative="1">
+      <w:start w:val="1"/>
+      <w:numFmt w:val="bullet"/>
+      <w:lvlText w:val=""/>
+      <w:lvlJc w:val="left"/>
+      <w:pPr>
+        <w:tabs>
+          <w:tab w:val="num" w:pos="5760"/>
+        </w:tabs>
+        <w:ind w:left="5760" w:hanging="360"/>
+      </w:pPr>
+      <w:rPr>
+        <w:rFonts w:ascii="Wingdings" w:hAnsi="Wingdings" w:hint="default"/>
+        <w:sz w:val="20"/>
+      </w:rPr>
+    </w:lvl>
+    <w:lvl w:ilvl="8" w:tentative="1">
+      <w:start w:val="1"/>
+      <w:numFmt w:val="bullet"/>
+      <w:lvlText w:val=""/>
+      <w:lvlJc w:val="left"/>
+      <w:pPr>
+        <w:tabs>
+          <w:tab w:val="num" w:pos="6480"/>
+        </w:tabs>
+        <w:ind w:left="6480" w:hanging="360"/>
+      </w:pPr>
+      <w:rPr>
+        <w:rFonts w:ascii="Wingdings" w:hAnsi="Wingdings" w:hint="default"/>
+        <w:sz w:val="20"/>
+      </w:rPr>
+    </w:lvl>
+  </w:abstractNum>
+  <w:abstractNum w:abstractNumId="11" w15:restartNumberingAfterBreak="0">
     <w:nsid w:val="7A0B3B47"/>
     <w:multiLevelType w:val="multilevel"/>
     <w:tmpl w:val="9DE60146"/>
@@ -2398,22 +4269,40 @@
     </w:lvl>
   </w:abstractNum>
   <w:num w:numId="1" w16cid:durableId="1001737807">
-    <w:abstractNumId w:val="4"/>
+    <w:abstractNumId w:val="7"/>
   </w:num>
   <w:num w:numId="2" w16cid:durableId="218446812">
-    <w:abstractNumId w:val="5"/>
+    <w:abstractNumId w:val="11"/>
   </w:num>
   <w:num w:numId="3" w16cid:durableId="1100298228">
+    <w:abstractNumId w:val="6"/>
+  </w:num>
+  <w:num w:numId="4" w16cid:durableId="1589457574">
     <w:abstractNumId w:val="3"/>
   </w:num>
-  <w:num w:numId="4" w16cid:durableId="1589457574">
-    <w:abstractNumId w:val="1"/>
-  </w:num>
   <w:num w:numId="5" w16cid:durableId="350567601">
-    <w:abstractNumId w:val="2"/>
+    <w:abstractNumId w:val="5"/>
   </w:num>
   <w:num w:numId="6" w16cid:durableId="1903757143">
     <w:abstractNumId w:val="0"/>
+  </w:num>
+  <w:num w:numId="7" w16cid:durableId="112024598">
+    <w:abstractNumId w:val="1"/>
+  </w:num>
+  <w:num w:numId="8" w16cid:durableId="1314984915">
+    <w:abstractNumId w:val="10"/>
+  </w:num>
+  <w:num w:numId="9" w16cid:durableId="1117794369">
+    <w:abstractNumId w:val="4"/>
+  </w:num>
+  <w:num w:numId="10" w16cid:durableId="1204055827">
+    <w:abstractNumId w:val="2"/>
+  </w:num>
+  <w:num w:numId="11" w16cid:durableId="2018147005">
+    <w:abstractNumId w:val="9"/>
+  </w:num>
+  <w:num w:numId="12" w16cid:durableId="132908627">
+    <w:abstractNumId w:val="8"/>
   </w:num>
 </w:numbering>
 </file>

</xml_diff>